<commit_message>
Apply Capstone Session 1A guidance
- Relabel report draft and deck as pre-Gateway planning notes
- Add blockers and dependencies to the proposal (markdown and Word)
- Add session rules to the capstone guide

Co-Authored-By: Claude Opus 5.5 <noreply@anthropic.com>
Claude-Session: https://claude.ai/code/session_01Mj5WNa5T8gBVKxxafWaY2A
</commit_message>
<xml_diff>
--- a/ASWE-EPA-Project/08_capstone-AM1/Capstone Project proposal - draft.docx
+++ b/ASWE-EPA-Project/08_capstone-AM1/Capstone Project proposal - draft.docx
@@ -1908,6 +1908,298 @@
                 <w:rtl w:val="0"/>
               </w:rPr>
               <w:t xml:space="preserve">research on knowledge debt and how developers search for information.</w:t>
+            </w:r>
+          </w:p>
+          <w:p>
+            <w:pPr>
+              <w:widowControl w:val="0"/>
+              <w:spacing w:before="200" w:line="240" w:lineRule="auto"/>
+              <w:rPr>
+                <w:rFonts w:ascii="Inter" w:cs="Inter" w:eastAsia="Inter" w:hAnsi="Inter"/>
+              </w:rPr>
+            </w:pPr>
+            <w:r>
+              <w:rPr>
+                <w:rFonts w:ascii="Inter" w:cs="Inter" w:eastAsia="Inter" w:hAnsi="Inter"/>
+                <w:b w:val="1"/>
+                <w:bCs w:val="1"/>
+              </w:rPr>
+              <w:t xml:space="preserve">Blockers and dependencies</w:t>
+            </w:r>
+          </w:p>
+          <w:p>
+            <w:pPr>
+              <w:widowControl w:val="0"/>
+              <w:numPr>
+                <w:ilvl w:val="0"/>
+                <w:numId w:val="1"/>
+              </w:numPr>
+              <w:spacing w:before="0" w:line="240" w:lineRule="auto"/>
+              <w:ind w:left="720" w:hanging="360"/>
+              <w:rPr>
+                <w:rFonts w:ascii="Inter" w:cs="Inter" w:eastAsia="Inter" w:hAnsi="Inter"/>
+              </w:rPr>
+            </w:pPr>
+            <w:r>
+              <w:rPr>
+                <w:rFonts w:ascii="Inter" w:cs="Inter" w:eastAsia="Inter" w:hAnsi="Inter"/>
+                <w:b w:val="1"/>
+                <w:bCs w:val="1"/>
+              </w:rPr>
+              <w:t xml:space="preserve">Customer consent</w:t>
+            </w:r>
+            <w:r>
+              <w:rPr>
+                <w:rFonts w:ascii="Inter" w:cs="Inter" w:eastAsia="Inter" w:hAnsi="Inter"/>
+              </w:rPr>
+              <w:t xml:space="preserve"> to use this project for the EPA (Version 1 AI Policy): line manager, before Gateway.</w:t>
+            </w:r>
+          </w:p>
+          <w:p>
+            <w:pPr>
+              <w:widowControl w:val="0"/>
+              <w:numPr>
+                <w:ilvl w:val="0"/>
+                <w:numId w:val="1"/>
+              </w:numPr>
+              <w:spacing w:before="0" w:line="240" w:lineRule="auto"/>
+              <w:ind w:left="720" w:hanging="360"/>
+              <w:rPr>
+                <w:rFonts w:ascii="Inter" w:cs="Inter" w:eastAsia="Inter" w:hAnsi="Inter"/>
+              </w:rPr>
+            </w:pPr>
+            <w:r>
+              <w:rPr>
+                <w:rFonts w:ascii="Inter" w:cs="Inter" w:eastAsia="Inter" w:hAnsi="Inter"/>
+                <w:b w:val="1"/>
+                <w:bCs w:val="1"/>
+              </w:rPr>
+              <w:t xml:space="preserve">API access</w:t>
+            </w:r>
+            <w:r>
+              <w:rPr>
+                <w:rFonts w:ascii="Inter" w:cs="Inter" w:eastAsia="Inter" w:hAnsi="Inter"/>
+              </w:rPr>
+              <w:t xml:space="preserve"> to Confluence and GitHub, excluding security-cleared repositories: platform administrators, week 3.</w:t>
+            </w:r>
+          </w:p>
+          <w:p>
+            <w:pPr>
+              <w:widowControl w:val="0"/>
+              <w:numPr>
+                <w:ilvl w:val="0"/>
+                <w:numId w:val="1"/>
+              </w:numPr>
+              <w:spacing w:before="0" w:line="240" w:lineRule="auto"/>
+              <w:ind w:left="720" w:hanging="360"/>
+              <w:rPr>
+                <w:rFonts w:ascii="Inter" w:cs="Inter" w:eastAsia="Inter" w:hAnsi="Inter"/>
+              </w:rPr>
+            </w:pPr>
+            <w:r>
+              <w:rPr>
+                <w:rFonts w:ascii="Inter" w:cs="Inter" w:eastAsia="Inter" w:hAnsi="Inter"/>
+                <w:b w:val="1"/>
+                <w:bCs w:val="1"/>
+              </w:rPr>
+              <w:t xml:space="preserve">Hosted model approval</w:t>
+            </w:r>
+            <w:r>
+              <w:rPr>
+                <w:rFonts w:ascii="Inter" w:cs="Inter" w:eastAsia="Inter" w:hAnsi="Inter"/>
+              </w:rPr>
+              <w:t xml:space="preserve"> with confirmed UK region and data terms: security and procurement, week 3.</w:t>
+            </w:r>
+          </w:p>
+          <w:p>
+            <w:pPr>
+              <w:widowControl w:val="0"/>
+              <w:numPr>
+                <w:ilvl w:val="0"/>
+                <w:numId w:val="1"/>
+              </w:numPr>
+              <w:spacing w:before="0" w:line="240" w:lineRule="auto"/>
+              <w:ind w:left="720" w:hanging="360"/>
+              <w:rPr>
+                <w:rFonts w:ascii="Inter" w:cs="Inter" w:eastAsia="Inter" w:hAnsi="Inter"/>
+              </w:rPr>
+            </w:pPr>
+            <w:r>
+              <w:rPr>
+                <w:rFonts w:ascii="Inter" w:cs="Inter" w:eastAsia="Inter" w:hAnsi="Inter"/>
+                <w:b w:val="1"/>
+                <w:bCs w:val="1"/>
+              </w:rPr>
+              <w:t xml:space="preserve">Security review</w:t>
+            </w:r>
+            <w:r>
+              <w:rPr>
+                <w:rFonts w:ascii="Inter" w:cs="Inter" w:eastAsia="Inter" w:hAnsi="Inter"/>
+              </w:rPr>
+              <w:t xml:space="preserve"> of data flow diagrams: security team, week 2.</w:t>
+            </w:r>
+          </w:p>
+          <w:p>
+            <w:pPr>
+              <w:widowControl w:val="0"/>
+              <w:numPr>
+                <w:ilvl w:val="0"/>
+                <w:numId w:val="1"/>
+              </w:numPr>
+              <w:spacing w:before="0" w:line="240" w:lineRule="auto"/>
+              <w:ind w:left="720" w:hanging="360"/>
+              <w:rPr>
+                <w:rFonts w:ascii="Inter" w:cs="Inter" w:eastAsia="Inter" w:hAnsi="Inter"/>
+              </w:rPr>
+            </w:pPr>
+            <w:r>
+              <w:rPr>
+                <w:rFonts w:ascii="Inter" w:cs="Inter" w:eastAsia="Inter" w:hAnsi="Inter"/>
+                <w:b w:val="1"/>
+                <w:bCs w:val="1"/>
+              </w:rPr>
+              <w:t xml:space="preserve">Data protection screening</w:t>
+            </w:r>
+            <w:r>
+              <w:rPr>
+                <w:rFonts w:ascii="Inter" w:cs="Inter" w:eastAsia="Inter" w:hAnsi="Inter"/>
+              </w:rPr>
+              <w:t xml:space="preserve">: data protection officer, week 1.</w:t>
+            </w:r>
+          </w:p>
+          <w:p>
+            <w:pPr>
+              <w:widowControl w:val="0"/>
+              <w:numPr>
+                <w:ilvl w:val="0"/>
+                <w:numId w:val="1"/>
+              </w:numPr>
+              <w:spacing w:before="0" w:line="240" w:lineRule="auto"/>
+              <w:ind w:left="720" w:hanging="360"/>
+              <w:rPr>
+                <w:rFonts w:ascii="Inter" w:cs="Inter" w:eastAsia="Inter" w:hAnsi="Inter"/>
+              </w:rPr>
+            </w:pPr>
+            <w:r>
+              <w:rPr>
+                <w:rFonts w:ascii="Inter" w:cs="Inter" w:eastAsia="Inter" w:hAnsi="Inter"/>
+                <w:b w:val="1"/>
+                <w:bCs w:val="1"/>
+              </w:rPr>
+              <w:t xml:space="preserve">Hosting environment</w:t>
+            </w:r>
+            <w:r>
+              <w:rPr>
+                <w:rFonts w:ascii="Inter" w:cs="Inter" w:eastAsia="Inter" w:hAnsi="Inter"/>
+              </w:rPr>
+              <w:t xml:space="preserve"> inside the registry's infrastructure: DevOps, week 3.</w:t>
+            </w:r>
+          </w:p>
+          <w:p>
+            <w:pPr>
+              <w:widowControl w:val="0"/>
+              <w:numPr>
+                <w:ilvl w:val="0"/>
+                <w:numId w:val="1"/>
+              </w:numPr>
+              <w:spacing w:before="0" w:line="240" w:lineRule="auto"/>
+              <w:ind w:left="720" w:hanging="360"/>
+              <w:rPr>
+                <w:rFonts w:ascii="Inter" w:cs="Inter" w:eastAsia="Inter" w:hAnsi="Inter"/>
+              </w:rPr>
+            </w:pPr>
+            <w:r>
+              <w:rPr>
+                <w:rFonts w:ascii="Inter" w:cs="Inter" w:eastAsia="Inter" w:hAnsi="Inter"/>
+                <w:b w:val="1"/>
+                <w:bCs w:val="1"/>
+              </w:rPr>
+              <w:t xml:space="preserve">Jira access</w:t>
+            </w:r>
+            <w:r>
+              <w:rPr>
+                <w:rFonts w:ascii="Inter" w:cs="Inter" w:eastAsia="Inter" w:hAnsi="Inter"/>
+              </w:rPr>
+              <w:t xml:space="preserve"> for the spike baseline: delivery manager, week 1.</w:t>
+            </w:r>
+          </w:p>
+          <w:p>
+            <w:pPr>
+              <w:widowControl w:val="0"/>
+              <w:numPr>
+                <w:ilvl w:val="0"/>
+                <w:numId w:val="1"/>
+              </w:numPr>
+              <w:spacing w:before="0" w:line="240" w:lineRule="auto"/>
+              <w:ind w:left="720" w:hanging="360"/>
+              <w:rPr>
+                <w:rFonts w:ascii="Inter" w:cs="Inter" w:eastAsia="Inter" w:hAnsi="Inter"/>
+              </w:rPr>
+            </w:pPr>
+            <w:r>
+              <w:rPr>
+                <w:rFonts w:ascii="Inter" w:cs="Inter" w:eastAsia="Inter" w:hAnsi="Inter"/>
+                <w:b w:val="1"/>
+                <w:bCs w:val="1"/>
+              </w:rPr>
+              <w:t xml:space="preserve">Ten pilot developers</w:t>
+            </w:r>
+            <w:r>
+              <w:rPr>
+                <w:rFonts w:ascii="Inter" w:cs="Inter" w:eastAsia="Inter" w:hAnsi="Inter"/>
+              </w:rPr>
+              <w:t xml:space="preserve"> with time agreed: delivery manager, week 8.</w:t>
+            </w:r>
+          </w:p>
+          <w:p>
+            <w:pPr>
+              <w:widowControl w:val="0"/>
+              <w:numPr>
+                <w:ilvl w:val="0"/>
+                <w:numId w:val="1"/>
+              </w:numPr>
+              <w:spacing w:before="0" w:line="240" w:lineRule="auto"/>
+              <w:ind w:left="720" w:hanging="360"/>
+              <w:rPr>
+                <w:rFonts w:ascii="Inter" w:cs="Inter" w:eastAsia="Inter" w:hAnsi="Inter"/>
+              </w:rPr>
+            </w:pPr>
+            <w:r>
+              <w:rPr>
+                <w:rFonts w:ascii="Inter" w:cs="Inter" w:eastAsia="Inter" w:hAnsi="Inter"/>
+                <w:b w:val="1"/>
+                <w:bCs w:val="1"/>
+              </w:rPr>
+              <w:t xml:space="preserve">Ethics and release sign-off</w:t>
+            </w:r>
+            <w:r>
+              <w:rPr>
+                <w:rFonts w:ascii="Inter" w:cs="Inter" w:eastAsia="Inter" w:hAnsi="Inter"/>
+              </w:rPr>
+              <w:t xml:space="preserve">: Technical Architects panel, week 8.</w:t>
+            </w:r>
+          </w:p>
+          <w:p>
+            <w:pPr>
+              <w:widowControl w:val="0"/>
+              <w:spacing w:before="120" w:line="240" w:lineRule="auto"/>
+              <w:rPr>
+                <w:rFonts w:ascii="Inter" w:cs="Inter" w:eastAsia="Inter" w:hAnsi="Inter"/>
+              </w:rPr>
+            </w:pPr>
+            <w:r>
+              <w:rPr>
+                <w:rFonts w:ascii="Inter" w:cs="Inter" w:eastAsia="Inter" w:hAnsi="Inter"/>
+                <w:b w:val="1"/>
+                <w:bCs w:val="1"/>
+              </w:rPr>
+              <w:t xml:space="preserve">Fallbacks: </w:t>
+            </w:r>
+            <w:r>
+              <w:rPr>
+                <w:rFonts w:ascii="Inter" w:cs="Inter" w:eastAsia="Inter" w:hAnsi="Inter"/>
+              </w:rPr>
+              <w:t xml:space="preserve">if API access is delayed, start with exported Confluence pages; if the hosted model is not approved, use the open-source model only; if fewer than ten volunteers join, extend the pilot by one sprint.</w:t>
             </w:r>
           </w:p>
         </w:tc>

</xml_diff>